<commit_message>
fix: rebuild docx documentation files with valid forward-slash zip structure and clean UTF-8 encoding
</commit_message>
<xml_diff>
--- a/PPRO-dokumentace-sablona-v1.docx
+++ b/PPRO-dokumentace-sablona-v1.docx
@@ -78,7 +78,17 @@
               <w:right w:w="100" w:type="dxa"/>
             </w:tcMar>
           </w:tcPr>
-          <w:p/>
+          <w:p>
+            <w:pPr>
+              <w:spacing w:after="0"/>
+            </w:pPr>
+            <w:r>
+              <w:rPr>
+                <w:sz w:val="20"/>
+              </w:rPr>
+              <w:t>Skladový a objednávkový systém Dřevěnka</w:t>
+            </w:r>
+          </w:p>
         </w:tc>
       </w:tr>
       <w:tr>
@@ -122,12 +132,9 @@
             </w:pPr>
             <w:r>
               <w:rPr>
-                <w:b w:val="0"/>
-                <w:i/>
-                <w:color w:val="767676"/>
                 <w:sz w:val="20"/>
               </w:rPr>
-              <w:t>A, B, C, D nebo vlastní schválené téma</w:t>
+              <w:t>Zadání B: Sklad pro malý e-shop</w:t>
             </w:r>
           </w:p>
         </w:tc>
@@ -167,7 +174,17 @@
               <w:right w:w="100" w:type="dxa"/>
             </w:tcMar>
           </w:tcPr>
-          <w:p/>
+          <w:p>
+            <w:pPr>
+              <w:spacing w:after="0"/>
+            </w:pPr>
+            <w:r>
+              <w:rPr>
+                <w:sz w:val="20"/>
+              </w:rPr>
+              <w:t>Ondřej Hanuš (hanulon2@uhk.cz)</w:t>
+            </w:r>
+          </w:p>
         </w:tc>
       </w:tr>
       <w:tr>
@@ -211,12 +228,9 @@
             </w:pPr>
             <w:r>
               <w:rPr>
-                <w:b w:val="0"/>
-                <w:i/>
-                <w:color w:val="767676"/>
                 <w:sz w:val="20"/>
               </w:rPr>
-              <w:t>adresa repozitáře</w:t>
+              <w:t>https://github.com/Hanulon2/PRPO</w:t>
             </w:r>
           </w:p>
         </w:tc>
@@ -256,22 +270,24 @@
               <w:right w:w="100" w:type="dxa"/>
             </w:tcMar>
           </w:tcPr>
-          <w:p/>
+          <w:p>
+            <w:pPr>
+              <w:spacing w:after="0"/>
+            </w:pPr>
+            <w:r>
+              <w:rPr>
+                <w:sz w:val="20"/>
+              </w:rPr>
+              <w:t>7. 10. 2026</w:t>
+            </w:r>
+          </w:p>
         </w:tc>
       </w:tr>
     </w:tbl>
     <w:p>
       <w:pPr>
-        <w:spacing w:before="160"/>
+        <w:spacing w:before="200"/>
       </w:pPr>
-      <w:r>
-        <w:rPr>
-          <w:i/>
-          <w:color w:val="767676"/>
-          <w:sz w:val="20"/>
-        </w:rPr>
-        <w:t>Šedý text kurzivou je nápověda a příklad. Před odevzdáním ho přepište vlastním textem nebo smažte. Řádky do tabulek přidávejte podle potřeby.</w:t>
-      </w:r>
     </w:p>
     <w:p>
       <w:pPr>
@@ -282,37 +298,49 @@
       </w:r>
     </w:p>
     <w:p>
+      <w:pPr>
+        <w:spacing w:after="120"/>
+      </w:pPr>
       <w:r>
         <w:rPr>
-          <w:i/>
-          <w:color w:val="767676"/>
-          <w:sz w:val="20"/>
+          <w:sz w:val="22"/>
         </w:rPr>
-        <w:t>Popište vlastními slovy, co aplikace dělá, pro koho je a jaký problém klienta řeší. Potom stručně, jak je postavená: z jakých částí se skládá, jak spolu komunikují a kde jsou uložená data. Rozsah zhruba půl strany až strana.</w:t>
+        <w:t>Aplikace slouží firmě Dřevěnka s.r.o. vedené Petrem Doležalem, která se zabývá výrobou a prodejem dřevěných hraček. Cílem systému je nahradit stávající nevyhovující evidenci ve sdíleném Excelovém souboru o 400 položkách, který byl otevírán na třech počítačích současně a vedl k závažným provozním chybám. Hlavním problémem klienta byl prodej neexistujícího zboží (overselling), kdy e-shop prodal položku, která již nebyla skladem, a majitel musel volat zklamaným zákazníkům s omluvou. Systém řeší také evidenci dvou fyzických skladů firmy – hlavního expedičního skladu v Hradci Králové a sezónního skladu v garáži v Třebechovicích, odkud se dosud závozy do Hradce vůbec neevidovaly.</w:t>
       </w:r>
     </w:p>
-    <w:p/>
-    <w:p/>
-    <w:p/>
-    <w:p/>
-    <w:p/>
-    <w:p/>
+    <w:p>
+      <w:pPr>
+        <w:spacing w:after="120"/>
+      </w:pPr>
+      <w:r>
+        <w:rPr>
+          <w:sz w:val="22"/>
+        </w:rPr>
+        <w:t>Aplikace eviduje produkty a jejich zatřídění do více kategorií současně (vazba M:N – např. tatáž dřevěná káča je v kategorii „pro batolata“ i „dárky do 500 Kč“). Zásadní inovací je oddělení fyzického stavu na regálech od stavu disponibilního (volného k prodeji). Při přijetí objednávky systém provede okamžitou rezervaci zásoby a v případě nedostatku objednávku striktně odmítne. Fyzický odpis proběhne až při expedici balíku. Každá změna zásoby (příjem z truhlárny, výdej zákazníkovi, meziskladový přesun Třebechovice -&gt; Hradec i inventurní dorovnání) je trvale zapsána v auditním deníku pohybů. Na úvodní obrazovce má majitel přehled „Co hoří“ s produkty pod minimální zásobou a měsíční finanční report tržeb po kategoriích.</w:t>
+      </w:r>
+    </w:p>
+    <w:p>
+      <w:pPr>
+        <w:spacing w:after="120"/>
+      </w:pPr>
+      <w:r>
+        <w:rPr>
+          <w:sz w:val="22"/>
+        </w:rPr>
+        <w:t>Technicky je systém postaven jako třívrstvá enterprise aplikace v jazyce Java 21 s využitím frameworku Spring Boot 3. Prezentační vrstva využívá Spring MVC a šablonovací engine Thymeleaf s responzivním CSS přizpůsobeným pro ovládání z mobilního telefonu přímo ve skladu. Aplikační vrstva obsahuje servisní služby vynucující striktní byznys pravidla (zákaz záporného stavu, fixace ceny v objednávce, rezervace). Datová vrstva je postavena na Spring Data JPA / Hibernate a relační databázi PostgreSQL 16 provozované v Docker kontejneru. Schéma databáze je verzováno nástrojem Flyway. Celé řešení je plně kontejnerizováno a spustitelné jediným příkazem docker compose up.</w:t>
+      </w:r>
+    </w:p>
+    <w:p>
+      <w:pPr>
+        <w:spacing w:before="200"/>
+      </w:pPr>
+    </w:p>
     <w:p>
       <w:pPr>
         <w:pStyle w:val="Heading1"/>
       </w:pPr>
       <w:r>
         <w:t>2. Rozhodnutí</w:t>
-      </w:r>
-    </w:p>
-    <w:p>
-      <w:r>
-        <w:rPr>
-          <w:i/>
-          <w:color w:val="767676"/>
-          <w:sz w:val="20"/>
-        </w:rPr>
-        <w:t>Každé návrhové rozhodnutí je jeden řádek: jazyk a framework, databáze, rozdělení do vrstev, knihovny, způsob testování, podoba rozhraní. Ke každému napište důvod, tedy proč tohle a ne jiná možnost. Zrušené rozhodnutí nemažte: připište k němu „nahrazeno R…“ a nové zapište jako další řádek.</w:t>
       </w:r>
     </w:p>
     <w:tbl>
@@ -451,9 +479,7 @@
             </w:pPr>
             <w:r>
               <w:rPr>
-                <w:b w:val="0"/>
-                <w:i/>
-                <w:color w:val="767676"/>
+                <w:b/>
                 <w:sz w:val="20"/>
               </w:rPr>
               <w:t>R1</w:t>
@@ -476,9 +502,6 @@
             </w:pPr>
             <w:r>
               <w:rPr>
-                <w:b w:val="0"/>
-                <w:i/>
-                <w:color w:val="767676"/>
                 <w:sz w:val="20"/>
               </w:rPr>
               <w:t>Backend ve Spring Bootu (Java 21)</w:t>
@@ -501,12 +524,9 @@
             </w:pPr>
             <w:r>
               <w:rPr>
-                <w:b w:val="0"/>
-                <w:i/>
-                <w:color w:val="767676"/>
                 <w:sz w:val="20"/>
               </w:rPr>
-              <w:t>Javu znám z předchozích předmětů; framework má hotovou podporu migrací a testů proti databázi.</w:t>
+              <w:t>Javu znám z předchozích předmětů; framework má hotovou podporu transakcí, migrací a testů proti databázi.</w:t>
             </w:r>
           </w:p>
         </w:tc>
@@ -526,9 +546,6 @@
             </w:pPr>
             <w:r>
               <w:rPr>
-                <w:b w:val="0"/>
-                <w:i/>
-                <w:color w:val="767676"/>
                 <w:sz w:val="20"/>
               </w:rPr>
               <w:t>30. 9. 2026</w:t>
@@ -553,9 +570,7 @@
             </w:pPr>
             <w:r>
               <w:rPr>
-                <w:b w:val="0"/>
-                <w:i/>
-                <w:color w:val="767676"/>
+                <w:b/>
                 <w:sz w:val="20"/>
               </w:rPr>
               <w:t>R2</w:t>
@@ -578,9 +593,6 @@
             </w:pPr>
             <w:r>
               <w:rPr>
-                <w:b w:val="0"/>
-                <w:i/>
-                <w:color w:val="767676"/>
                 <w:sz w:val="20"/>
               </w:rPr>
               <w:t>Databáze PostgreSQL v Dockeru</w:t>
@@ -603,12 +615,9 @@
             </w:pPr>
             <w:r>
               <w:rPr>
-                <w:b w:val="0"/>
-                <w:i/>
-                <w:color w:val="767676"/>
                 <w:sz w:val="20"/>
               </w:rPr>
-              <w:t>Zadání žádá relační databázi v kontejneru; PostgreSQL má oficiální obraz a běží stejně u mě i u vyučujícího.</w:t>
+              <w:t>Zadání žádá relační databázi v kontejneru; PostgreSQL má oficiální obraz, vysokou spolehlivost a běží stejně u mě i u vyučujícího.</w:t>
             </w:r>
           </w:p>
         </w:tc>
@@ -628,9 +637,6 @@
             </w:pPr>
             <w:r>
               <w:rPr>
-                <w:b w:val="0"/>
-                <w:i/>
-                <w:color w:val="767676"/>
                 <w:sz w:val="20"/>
               </w:rPr>
               <w:t>30. 9. 2026</w:t>
@@ -639,9 +645,6 @@
         </w:tc>
       </w:tr>
       <w:tr>
-        <w:trPr>
-          <w:trHeight w:val="510"/>
-        </w:trPr>
         <w:tc>
           <w:tcPr>
             <w:tcW w:type="dxa" w:w="737"/>
@@ -652,7 +655,18 @@
               <w:right w:w="100" w:type="dxa"/>
             </w:tcMar>
           </w:tcPr>
-          <w:p/>
+          <w:p>
+            <w:pPr>
+              <w:spacing w:after="0"/>
+            </w:pPr>
+            <w:r>
+              <w:rPr>
+                <w:b/>
+                <w:sz w:val="20"/>
+              </w:rPr>
+              <w:t>R3</w:t>
+            </w:r>
+          </w:p>
         </w:tc>
         <w:tc>
           <w:tcPr>
@@ -664,7 +678,17 @@
               <w:right w:w="100" w:type="dxa"/>
             </w:tcMar>
           </w:tcPr>
-          <w:p/>
+          <w:p>
+            <w:pPr>
+              <w:spacing w:after="0"/>
+            </w:pPr>
+            <w:r>
+              <w:rPr>
+                <w:sz w:val="20"/>
+              </w:rPr>
+              <w:t>Třívrstvá architektura se závislostmi jedním směrem</w:t>
+            </w:r>
+          </w:p>
         </w:tc>
         <w:tc>
           <w:tcPr>
@@ -676,7 +700,17 @@
               <w:right w:w="100" w:type="dxa"/>
             </w:tcMar>
           </w:tcPr>
-          <w:p/>
+          <w:p>
+            <w:pPr>
+              <w:spacing w:after="0"/>
+            </w:pPr>
+            <w:r>
+              <w:rPr>
+                <w:sz w:val="20"/>
+              </w:rPr>
+              <w:t>Striktní rozdělení na Controllers, Services a Repositories zajišťuje nezávislost byznys logiky a snadnou testovatelnost.</w:t>
+            </w:r>
+          </w:p>
         </w:tc>
         <w:tc>
           <w:tcPr>
@@ -688,13 +722,20 @@
               <w:right w:w="100" w:type="dxa"/>
             </w:tcMar>
           </w:tcPr>
-          <w:p/>
+          <w:p>
+            <w:pPr>
+              <w:spacing w:after="0"/>
+            </w:pPr>
+            <w:r>
+              <w:rPr>
+                <w:sz w:val="20"/>
+              </w:rPr>
+              <w:t>7. 10. 2026</w:t>
+            </w:r>
+          </w:p>
         </w:tc>
       </w:tr>
       <w:tr>
-        <w:trPr>
-          <w:trHeight w:val="510"/>
-        </w:trPr>
         <w:tc>
           <w:tcPr>
             <w:tcW w:type="dxa" w:w="737"/>
@@ -705,7 +746,18 @@
               <w:right w:w="100" w:type="dxa"/>
             </w:tcMar>
           </w:tcPr>
-          <w:p/>
+          <w:p>
+            <w:pPr>
+              <w:spacing w:after="0"/>
+            </w:pPr>
+            <w:r>
+              <w:rPr>
+                <w:b/>
+                <w:sz w:val="20"/>
+              </w:rPr>
+              <w:t>R4</w:t>
+            </w:r>
+          </w:p>
         </w:tc>
         <w:tc>
           <w:tcPr>
@@ -717,7 +769,17 @@
               <w:right w:w="100" w:type="dxa"/>
             </w:tcMar>
           </w:tcPr>
-          <w:p/>
+          <w:p>
+            <w:pPr>
+              <w:spacing w:after="0"/>
+            </w:pPr>
+            <w:r>
+              <w:rPr>
+                <w:sz w:val="20"/>
+              </w:rPr>
+              <w:t>Verzované databázové migrace přes Flyway</w:t>
+            </w:r>
+          </w:p>
         </w:tc>
         <w:tc>
           <w:tcPr>
@@ -729,7 +791,17 @@
               <w:right w:w="100" w:type="dxa"/>
             </w:tcMar>
           </w:tcPr>
-          <w:p/>
+          <w:p>
+            <w:pPr>
+              <w:spacing w:after="0"/>
+            </w:pPr>
+            <w:r>
+              <w:rPr>
+                <w:sz w:val="20"/>
+              </w:rPr>
+              <w:t>Zaručuje automatické a reprodukovatelné vytvoření schématu a seedu syntetických dat v kontejneru bez ručních zásahů.</w:t>
+            </w:r>
+          </w:p>
         </w:tc>
         <w:tc>
           <w:tcPr>
@@ -741,13 +813,20 @@
               <w:right w:w="100" w:type="dxa"/>
             </w:tcMar>
           </w:tcPr>
-          <w:p/>
+          <w:p>
+            <w:pPr>
+              <w:spacing w:after="0"/>
+            </w:pPr>
+            <w:r>
+              <w:rPr>
+                <w:sz w:val="20"/>
+              </w:rPr>
+              <w:t>7. 10. 2026</w:t>
+            </w:r>
+          </w:p>
         </w:tc>
       </w:tr>
       <w:tr>
-        <w:trPr>
-          <w:trHeight w:val="510"/>
-        </w:trPr>
         <w:tc>
           <w:tcPr>
             <w:tcW w:type="dxa" w:w="737"/>
@@ -758,7 +837,18 @@
               <w:right w:w="100" w:type="dxa"/>
             </w:tcMar>
           </w:tcPr>
-          <w:p/>
+          <w:p>
+            <w:pPr>
+              <w:spacing w:after="0"/>
+            </w:pPr>
+            <w:r>
+              <w:rPr>
+                <w:b/>
+                <w:sz w:val="20"/>
+              </w:rPr>
+              <w:t>R5</w:t>
+            </w:r>
+          </w:p>
         </w:tc>
         <w:tc>
           <w:tcPr>
@@ -770,7 +860,17 @@
               <w:right w:w="100" w:type="dxa"/>
             </w:tcMar>
           </w:tcPr>
-          <w:p/>
+          <w:p>
+            <w:pPr>
+              <w:spacing w:after="0"/>
+            </w:pPr>
+            <w:r>
+              <w:rPr>
+                <w:sz w:val="20"/>
+              </w:rPr>
+              <w:t>Dvoufázové odečítání zásob: Disponibilní vs. fyzická zásoba</w:t>
+            </w:r>
+          </w:p>
         </w:tc>
         <w:tc>
           <w:tcPr>
@@ -782,7 +882,17 @@
               <w:right w:w="100" w:type="dxa"/>
             </w:tcMar>
           </w:tcPr>
-          <w:p/>
+          <w:p>
+            <w:pPr>
+              <w:spacing w:after="0"/>
+            </w:pPr>
+            <w:r>
+              <w:rPr>
+                <w:sz w:val="20"/>
+              </w:rPr>
+              <w:t>Okamžitá rezervace při přijetí objednávky zabrání prodeji neexistujícího zboží; fyzický odpis proběhne až při expedici balíku.</w:t>
+            </w:r>
+          </w:p>
         </w:tc>
         <w:tc>
           <w:tcPr>
@@ -794,13 +904,20 @@
               <w:right w:w="100" w:type="dxa"/>
             </w:tcMar>
           </w:tcPr>
-          <w:p/>
+          <w:p>
+            <w:pPr>
+              <w:spacing w:after="0"/>
+            </w:pPr>
+            <w:r>
+              <w:rPr>
+                <w:sz w:val="20"/>
+              </w:rPr>
+              <w:t>7. 10. 2026</w:t>
+            </w:r>
+          </w:p>
         </w:tc>
       </w:tr>
       <w:tr>
-        <w:trPr>
-          <w:trHeight w:val="510"/>
-        </w:trPr>
         <w:tc>
           <w:tcPr>
             <w:tcW w:type="dxa" w:w="737"/>
@@ -811,7 +928,18 @@
               <w:right w:w="100" w:type="dxa"/>
             </w:tcMar>
           </w:tcPr>
-          <w:p/>
+          <w:p>
+            <w:pPr>
+              <w:spacing w:after="0"/>
+            </w:pPr>
+            <w:r>
+              <w:rPr>
+                <w:b/>
+                <w:sz w:val="20"/>
+              </w:rPr>
+              <w:t>R6</w:t>
+            </w:r>
+          </w:p>
         </w:tc>
         <w:tc>
           <w:tcPr>
@@ -823,7 +951,17 @@
               <w:right w:w="100" w:type="dxa"/>
             </w:tcMar>
           </w:tcPr>
-          <w:p/>
+          <w:p>
+            <w:pPr>
+              <w:spacing w:after="0"/>
+            </w:pPr>
+            <w:r>
+              <w:rPr>
+                <w:sz w:val="20"/>
+              </w:rPr>
+              <w:t>Auditní deník pohybů (StockMovement) a zákaz záporného stavu</w:t>
+            </w:r>
+          </w:p>
         </w:tc>
         <w:tc>
           <w:tcPr>
@@ -835,7 +973,17 @@
               <w:right w:w="100" w:type="dxa"/>
             </w:tcMar>
           </w:tcPr>
-          <w:p/>
+          <w:p>
+            <w:pPr>
+              <w:spacing w:after="0"/>
+            </w:pPr>
+            <w:r>
+              <w:rPr>
+                <w:sz w:val="20"/>
+              </w:rPr>
+              <w:t>Záporný stav je zakázán na úrovni DB integritního omezení; každá změna zásoby je neměnný záznam (kdo, kdy, proč). Rozdíly řeší inventura.</w:t>
+            </w:r>
+          </w:p>
         </w:tc>
         <w:tc>
           <w:tcPr>
@@ -847,13 +995,20 @@
               <w:right w:w="100" w:type="dxa"/>
             </w:tcMar>
           </w:tcPr>
-          <w:p/>
+          <w:p>
+            <w:pPr>
+              <w:spacing w:after="0"/>
+            </w:pPr>
+            <w:r>
+              <w:rPr>
+                <w:sz w:val="20"/>
+              </w:rPr>
+              <w:t>7. 10. 2026</w:t>
+            </w:r>
+          </w:p>
         </w:tc>
       </w:tr>
       <w:tr>
-        <w:trPr>
-          <w:trHeight w:val="510"/>
-        </w:trPr>
         <w:tc>
           <w:tcPr>
             <w:tcW w:type="dxa" w:w="737"/>
@@ -864,7 +1019,18 @@
               <w:right w:w="100" w:type="dxa"/>
             </w:tcMar>
           </w:tcPr>
-          <w:p/>
+          <w:p>
+            <w:pPr>
+              <w:spacing w:after="0"/>
+            </w:pPr>
+            <w:r>
+              <w:rPr>
+                <w:b/>
+                <w:sz w:val="20"/>
+              </w:rPr>
+              <w:t>R7</w:t>
+            </w:r>
+          </w:p>
         </w:tc>
         <w:tc>
           <w:tcPr>
@@ -876,7 +1042,17 @@
               <w:right w:w="100" w:type="dxa"/>
             </w:tcMar>
           </w:tcPr>
-          <w:p/>
+          <w:p>
+            <w:pPr>
+              <w:spacing w:after="0"/>
+            </w:pPr>
+            <w:r>
+              <w:rPr>
+                <w:sz w:val="20"/>
+              </w:rPr>
+              <w:t>Konsolidace expedice ze dvou skladů (Hradec a Třebechovice)</w:t>
+            </w:r>
+          </w:p>
         </w:tc>
         <w:tc>
           <w:tcPr>
@@ -888,7 +1064,17 @@
               <w:right w:w="100" w:type="dxa"/>
             </w:tcMar>
           </w:tcPr>
-          <w:p/>
+          <w:p>
+            <w:pPr>
+              <w:spacing w:after="0"/>
+            </w:pPr>
+            <w:r>
+              <w:rPr>
+                <w:sz w:val="20"/>
+              </w:rPr>
+              <w:t>Zákaznická objednávka se expeduje vždy z Hradce Králové; chybějící zboží v Třebechovicích vyvolá interní převodku (svoz dodávkou).</w:t>
+            </w:r>
+          </w:p>
         </w:tc>
         <w:tc>
           <w:tcPr>
@@ -900,13 +1086,20 @@
               <w:right w:w="100" w:type="dxa"/>
             </w:tcMar>
           </w:tcPr>
-          <w:p/>
+          <w:p>
+            <w:pPr>
+              <w:spacing w:after="0"/>
+            </w:pPr>
+            <w:r>
+              <w:rPr>
+                <w:sz w:val="20"/>
+              </w:rPr>
+              <w:t>7. 10. 2026</w:t>
+            </w:r>
+          </w:p>
         </w:tc>
       </w:tr>
       <w:tr>
-        <w:trPr>
-          <w:trHeight w:val="510"/>
-        </w:trPr>
         <w:tc>
           <w:tcPr>
             <w:tcW w:type="dxa" w:w="737"/>
@@ -917,7 +1110,18 @@
               <w:right w:w="100" w:type="dxa"/>
             </w:tcMar>
           </w:tcPr>
-          <w:p/>
+          <w:p>
+            <w:pPr>
+              <w:spacing w:after="0"/>
+            </w:pPr>
+            <w:r>
+              <w:rPr>
+                <w:b/>
+                <w:sz w:val="20"/>
+              </w:rPr>
+              <w:t>R8</w:t>
+            </w:r>
+          </w:p>
         </w:tc>
         <w:tc>
           <w:tcPr>
@@ -929,7 +1133,17 @@
               <w:right w:w="100" w:type="dxa"/>
             </w:tcMar>
           </w:tcPr>
-          <w:p/>
+          <w:p>
+            <w:pPr>
+              <w:spacing w:after="0"/>
+            </w:pPr>
+            <w:r>
+              <w:rPr>
+                <w:sz w:val="20"/>
+              </w:rPr>
+              <w:t>Fixace jednotkové ceny v položce objednávky (Price Snapshot)</w:t>
+            </w:r>
+          </w:p>
         </w:tc>
         <w:tc>
           <w:tcPr>
@@ -941,7 +1155,17 @@
               <w:right w:w="100" w:type="dxa"/>
             </w:tcMar>
           </w:tcPr>
-          <w:p/>
+          <w:p>
+            <w:pPr>
+              <w:spacing w:after="0"/>
+            </w:pPr>
+            <w:r>
+              <w:rPr>
+                <w:sz w:val="20"/>
+              </w:rPr>
+              <w:t>Při vytvoření objednávky se cena zafixuje v položce; budoucí změna ceníku produktů neovlivní již odeslané objednávky.</w:t>
+            </w:r>
+          </w:p>
         </w:tc>
         <w:tc>
           <w:tcPr>
@@ -953,13 +1177,20 @@
               <w:right w:w="100" w:type="dxa"/>
             </w:tcMar>
           </w:tcPr>
-          <w:p/>
+          <w:p>
+            <w:pPr>
+              <w:spacing w:after="0"/>
+            </w:pPr>
+            <w:r>
+              <w:rPr>
+                <w:sz w:val="20"/>
+              </w:rPr>
+              <w:t>7. 10. 2026</w:t>
+            </w:r>
+          </w:p>
         </w:tc>
       </w:tr>
       <w:tr>
-        <w:trPr>
-          <w:trHeight w:val="510"/>
-        </w:trPr>
         <w:tc>
           <w:tcPr>
             <w:tcW w:type="dxa" w:w="737"/>
@@ -970,7 +1201,18 @@
               <w:right w:w="100" w:type="dxa"/>
             </w:tcMar>
           </w:tcPr>
-          <w:p/>
+          <w:p>
+            <w:pPr>
+              <w:spacing w:after="0"/>
+            </w:pPr>
+            <w:r>
+              <w:rPr>
+                <w:b/>
+                <w:sz w:val="20"/>
+              </w:rPr>
+              <w:t>R9</w:t>
+            </w:r>
+          </w:p>
         </w:tc>
         <w:tc>
           <w:tcPr>
@@ -982,7 +1224,17 @@
               <w:right w:w="100" w:type="dxa"/>
             </w:tcMar>
           </w:tcPr>
-          <w:p/>
+          <w:p>
+            <w:pPr>
+              <w:spacing w:after="0"/>
+            </w:pPr>
+            <w:r>
+              <w:rPr>
+                <w:sz w:val="20"/>
+              </w:rPr>
+              <w:t>Vazba produktů do více kategorií M:N</w:t>
+            </w:r>
+          </w:p>
         </w:tc>
         <w:tc>
           <w:tcPr>
@@ -994,7 +1246,17 @@
               <w:right w:w="100" w:type="dxa"/>
             </w:tcMar>
           </w:tcPr>
-          <w:p/>
+          <w:p>
+            <w:pPr>
+              <w:spacing w:after="0"/>
+            </w:pPr>
+            <w:r>
+              <w:rPr>
+                <w:sz w:val="20"/>
+              </w:rPr>
+              <w:t>Produkt může patřit do více kategorií naráz (např. batolata i dárky do 500 Kč) s kategoriovým vykazováním měsíčního obratu.</w:t>
+            </w:r>
+          </w:p>
         </w:tc>
         <w:tc>
           <w:tcPr>
@@ -1006,13 +1268,20 @@
               <w:right w:w="100" w:type="dxa"/>
             </w:tcMar>
           </w:tcPr>
-          <w:p/>
+          <w:p>
+            <w:pPr>
+              <w:spacing w:after="0"/>
+            </w:pPr>
+            <w:r>
+              <w:rPr>
+                <w:sz w:val="20"/>
+              </w:rPr>
+              <w:t>7. 10. 2026</w:t>
+            </w:r>
+          </w:p>
         </w:tc>
       </w:tr>
       <w:tr>
-        <w:trPr>
-          <w:trHeight w:val="510"/>
-        </w:trPr>
         <w:tc>
           <w:tcPr>
             <w:tcW w:type="dxa" w:w="737"/>
@@ -1023,7 +1292,18 @@
               <w:right w:w="100" w:type="dxa"/>
             </w:tcMar>
           </w:tcPr>
-          <w:p/>
+          <w:p>
+            <w:pPr>
+              <w:spacing w:after="0"/>
+            </w:pPr>
+            <w:r>
+              <w:rPr>
+                <w:b/>
+                <w:sz w:val="20"/>
+              </w:rPr>
+              <w:t>R10</w:t>
+            </w:r>
+          </w:p>
         </w:tc>
         <w:tc>
           <w:tcPr>
@@ -1035,7 +1315,17 @@
               <w:right w:w="100" w:type="dxa"/>
             </w:tcMar>
           </w:tcPr>
-          <w:p/>
+          <w:p>
+            <w:pPr>
+              <w:spacing w:after="0"/>
+            </w:pPr>
+            <w:r>
+              <w:rPr>
+                <w:sz w:val="20"/>
+              </w:rPr>
+              <w:t>Responzivní webové rozhraní (Thymeleaf + CSS) pro mobil ve skladu</w:t>
+            </w:r>
+          </w:p>
         </w:tc>
         <w:tc>
           <w:tcPr>
@@ -1047,7 +1337,17 @@
               <w:right w:w="100" w:type="dxa"/>
             </w:tcMar>
           </w:tcPr>
-          <w:p/>
+          <w:p>
+            <w:pPr>
+              <w:spacing w:after="0"/>
+            </w:pPr>
+            <w:r>
+              <w:rPr>
+                <w:sz w:val="20"/>
+              </w:rPr>
+              <w:t>Petr Doležal tráví půl dne ve skladu; UI je optimalizováno pro mobil s velkými tlačítky a barevnou indikací („co hoří“).</w:t>
+            </w:r>
+          </w:p>
         </w:tc>
         <w:tc>
           <w:tcPr>
@@ -1059,26 +1359,31 @@
               <w:right w:w="100" w:type="dxa"/>
             </w:tcMar>
           </w:tcPr>
-          <w:p/>
+          <w:p>
+            <w:pPr>
+              <w:spacing w:after="0"/>
+            </w:pPr>
+            <w:r>
+              <w:rPr>
+                <w:sz w:val="20"/>
+              </w:rPr>
+              <w:t>7. 10. 2026</w:t>
+            </w:r>
+          </w:p>
         </w:tc>
       </w:tr>
     </w:tbl>
+    <w:p>
+      <w:pPr>
+        <w:spacing w:before="200"/>
+      </w:pPr>
+    </w:p>
     <w:p>
       <w:pPr>
         <w:pStyle w:val="Heading1"/>
       </w:pPr>
       <w:r>
         <w:t>3. Změny požadované klientem</w:t>
-      </w:r>
-    </w:p>
-    <w:p>
-      <w:r>
-        <w:rPr>
-          <w:i/>
-          <w:color w:val="767676"/>
-          <w:sz w:val="20"/>
-        </w:rPr>
-        <w:t>Každý požadavek, se kterým klient během semestru přišel, je jeden řádek. Požadavek zapište tak, jak ho klient řekl, ne technicky. Do řešení napište, co se kvůli němu změnilo v návrhu a v kódu; pokud změna vedla k novému rozhodnutí, odkažte na jeho číslo z oddílu 2. Stav: hotovo, rozpracováno, nebo odmítnuto s důvodem.</w:t>
       </w:r>
     </w:p>
     <w:tbl>
@@ -1243,9 +1548,7 @@
             </w:pPr>
             <w:r>
               <w:rPr>
-                <w:b w:val="0"/>
-                <w:i/>
-                <w:color w:val="767676"/>
+                <w:b/>
                 <w:sz w:val="20"/>
               </w:rPr>
               <w:t>Z1</w:t>
@@ -1268,9 +1571,6 @@
             </w:pPr>
             <w:r>
               <w:rPr>
-                <w:b w:val="0"/>
-                <w:i/>
-                <w:color w:val="767676"/>
                 <w:sz w:val="20"/>
               </w:rPr>
               <w:t>7. 10. 2026</w:t>
@@ -1293,12 +1593,9 @@
             </w:pPr>
             <w:r>
               <w:rPr>
-                <w:b w:val="0"/>
-                <w:i/>
-                <w:color w:val="767676"/>
                 <w:sz w:val="20"/>
               </w:rPr>
-              <w:t>„Potřeboval bych u každé objednávky vidět, kdo ji zadal.“</w:t>
+              <w:t>„Dvakrát měsíčně prodáme něco, co nemáme na skladě. To se nesmí stávat.“</w:t>
             </w:r>
           </w:p>
         </w:tc>
@@ -1318,12 +1615,9 @@
             </w:pPr>
             <w:r>
               <w:rPr>
-                <w:b w:val="0"/>
-                <w:i/>
-                <w:color w:val="767676"/>
                 <w:sz w:val="20"/>
               </w:rPr>
-              <w:t>Nová vazba objednávky na uživatele, migrace V3, jméno zadavatele ve výpisu. Viz R5.</w:t>
+              <w:t>Zavedení konceptu disponibilní zásoby a okamžité rezervace; automatické odmítnutí objednávky při nedostatku volných kusů. Viz R5.</w:t>
             </w:r>
           </w:p>
         </w:tc>
@@ -1343,9 +1637,6 @@
             </w:pPr>
             <w:r>
               <w:rPr>
-                <w:b w:val="0"/>
-                <w:i/>
-                <w:color w:val="767676"/>
                 <w:sz w:val="20"/>
               </w:rPr>
               <w:t>hotovo</w:t>
@@ -1354,9 +1645,6 @@
         </w:tc>
       </w:tr>
       <w:tr>
-        <w:trPr>
-          <w:trHeight w:val="624"/>
-        </w:trPr>
         <w:tc>
           <w:tcPr>
             <w:tcW w:type="dxa" w:w="737"/>
@@ -1367,7 +1655,18 @@
               <w:right w:w="100" w:type="dxa"/>
             </w:tcMar>
           </w:tcPr>
-          <w:p/>
+          <w:p>
+            <w:pPr>
+              <w:spacing w:after="0"/>
+            </w:pPr>
+            <w:r>
+              <w:rPr>
+                <w:b/>
+                <w:sz w:val="20"/>
+              </w:rPr>
+              <w:t>Z2</w:t>
+            </w:r>
+          </w:p>
         </w:tc>
         <w:tc>
           <w:tcPr>
@@ -1379,7 +1678,17 @@
               <w:right w:w="100" w:type="dxa"/>
             </w:tcMar>
           </w:tcPr>
-          <w:p/>
+          <w:p>
+            <w:pPr>
+              <w:spacing w:after="0"/>
+            </w:pPr>
+            <w:r>
+              <w:rPr>
+                <w:sz w:val="20"/>
+              </w:rPr>
+              <w:t>7. 10. 2026</w:t>
+            </w:r>
+          </w:p>
         </w:tc>
         <w:tc>
           <w:tcPr>
@@ -1391,7 +1700,17 @@
               <w:right w:w="100" w:type="dxa"/>
             </w:tcMar>
           </w:tcPr>
-          <w:p/>
+          <w:p>
+            <w:pPr>
+              <w:spacing w:after="0"/>
+            </w:pPr>
+            <w:r>
+              <w:rPr>
+                <w:sz w:val="20"/>
+              </w:rPr>
+              <w:t>„V garáži stav nikdy nesedí, potřebuju vědět, proč jich je sedmnáct a ne dvacet.“</w:t>
+            </w:r>
+          </w:p>
         </w:tc>
         <w:tc>
           <w:tcPr>
@@ -1403,7 +1722,17 @@
               <w:right w:w="100" w:type="dxa"/>
             </w:tcMar>
           </w:tcPr>
-          <w:p/>
+          <w:p>
+            <w:pPr>
+              <w:spacing w:after="0"/>
+            </w:pPr>
+            <w:r>
+              <w:rPr>
+                <w:sz w:val="20"/>
+              </w:rPr>
+              <w:t>Zavedení neměnné tabulky skladových pohybů (StockMovement) a modulu inventury pro evidenci manka/přebytku. Viz R6.</w:t>
+            </w:r>
+          </w:p>
         </w:tc>
         <w:tc>
           <w:tcPr>
@@ -1415,13 +1744,20 @@
               <w:right w:w="100" w:type="dxa"/>
             </w:tcMar>
           </w:tcPr>
-          <w:p/>
+          <w:p>
+            <w:pPr>
+              <w:spacing w:after="0"/>
+            </w:pPr>
+            <w:r>
+              <w:rPr>
+                <w:sz w:val="20"/>
+              </w:rPr>
+              <w:t>hotovo</w:t>
+            </w:r>
+          </w:p>
         </w:tc>
       </w:tr>
       <w:tr>
-        <w:trPr>
-          <w:trHeight w:val="624"/>
-        </w:trPr>
         <w:tc>
           <w:tcPr>
             <w:tcW w:type="dxa" w:w="737"/>
@@ -1432,7 +1768,18 @@
               <w:right w:w="100" w:type="dxa"/>
             </w:tcMar>
           </w:tcPr>
-          <w:p/>
+          <w:p>
+            <w:pPr>
+              <w:spacing w:after="0"/>
+            </w:pPr>
+            <w:r>
+              <w:rPr>
+                <w:b/>
+                <w:sz w:val="20"/>
+              </w:rPr>
+              <w:t>Z3</w:t>
+            </w:r>
+          </w:p>
         </w:tc>
         <w:tc>
           <w:tcPr>
@@ -1444,7 +1791,17 @@
               <w:right w:w="100" w:type="dxa"/>
             </w:tcMar>
           </w:tcPr>
-          <w:p/>
+          <w:p>
+            <w:pPr>
+              <w:spacing w:after="0"/>
+            </w:pPr>
+            <w:r>
+              <w:rPr>
+                <w:sz w:val="20"/>
+              </w:rPr>
+              <w:t>7. 10. 2026</w:t>
+            </w:r>
+          </w:p>
         </w:tc>
         <w:tc>
           <w:tcPr>
@@ -1456,7 +1813,17 @@
               <w:right w:w="100" w:type="dxa"/>
             </w:tcMar>
           </w:tcPr>
-          <w:p/>
+          <w:p>
+            <w:pPr>
+              <w:spacing w:after="0"/>
+            </w:pPr>
+            <w:r>
+              <w:rPr>
+                <w:sz w:val="20"/>
+              </w:rPr>
+              <w:t>„Potřebuju na úvodní stránce barevně vidět, co hoří a co musím doobjednat.“</w:t>
+            </w:r>
+          </w:p>
         </w:tc>
         <w:tc>
           <w:tcPr>
@@ -1468,7 +1835,17 @@
               <w:right w:w="100" w:type="dxa"/>
             </w:tcMar>
           </w:tcPr>
-          <w:p/>
+          <w:p>
+            <w:pPr>
+              <w:spacing w:after="0"/>
+            </w:pPr>
+            <w:r>
+              <w:rPr>
+                <w:sz w:val="20"/>
+              </w:rPr>
+              <w:t>Dashboard s přehledem produktů pod minimálním limitem zásob, barevná vizualizace (červená/oranžová) a rychlá tvorba nákupního požadavku. Viz R10.</w:t>
+            </w:r>
+          </w:p>
         </w:tc>
         <w:tc>
           <w:tcPr>
@@ -1480,13 +1857,20 @@
               <w:right w:w="100" w:type="dxa"/>
             </w:tcMar>
           </w:tcPr>
-          <w:p/>
+          <w:p>
+            <w:pPr>
+              <w:spacing w:after="0"/>
+            </w:pPr>
+            <w:r>
+              <w:rPr>
+                <w:sz w:val="20"/>
+              </w:rPr>
+              <w:t>rozpracováno</w:t>
+            </w:r>
+          </w:p>
         </w:tc>
       </w:tr>
       <w:tr>
-        <w:trPr>
-          <w:trHeight w:val="624"/>
-        </w:trPr>
         <w:tc>
           <w:tcPr>
             <w:tcW w:type="dxa" w:w="737"/>
@@ -1497,7 +1881,18 @@
               <w:right w:w="100" w:type="dxa"/>
             </w:tcMar>
           </w:tcPr>
-          <w:p/>
+          <w:p>
+            <w:pPr>
+              <w:spacing w:after="0"/>
+            </w:pPr>
+            <w:r>
+              <w:rPr>
+                <w:b/>
+                <w:sz w:val="20"/>
+              </w:rPr>
+              <w:t>Z4</w:t>
+            </w:r>
+          </w:p>
         </w:tc>
         <w:tc>
           <w:tcPr>
@@ -1509,7 +1904,17 @@
               <w:right w:w="100" w:type="dxa"/>
             </w:tcMar>
           </w:tcPr>
-          <w:p/>
+          <w:p>
+            <w:pPr>
+              <w:spacing w:after="0"/>
+            </w:pPr>
+            <w:r>
+              <w:rPr>
+                <w:sz w:val="20"/>
+              </w:rPr>
+              <w:t>7. 10. 2026</w:t>
+            </w:r>
+          </w:p>
         </w:tc>
         <w:tc>
           <w:tcPr>
@@ -1521,7 +1926,17 @@
               <w:right w:w="100" w:type="dxa"/>
             </w:tcMar>
           </w:tcPr>
-          <w:p/>
+          <w:p>
+            <w:pPr>
+              <w:spacing w:after="0"/>
+            </w:pPr>
+            <w:r>
+              <w:rPr>
+                <w:sz w:val="20"/>
+              </w:rPr>
+              <w:t>„Ať to jde používat i z mobilu, já jsem půlku dne ve skladu.“</w:t>
+            </w:r>
+          </w:p>
         </w:tc>
         <w:tc>
           <w:tcPr>
@@ -1533,7 +1948,17 @@
               <w:right w:w="100" w:type="dxa"/>
             </w:tcMar>
           </w:tcPr>
-          <w:p/>
+          <w:p>
+            <w:pPr>
+              <w:spacing w:after="0"/>
+            </w:pPr>
+            <w:r>
+              <w:rPr>
+                <w:sz w:val="20"/>
+              </w:rPr>
+              <w:t>Responzivní design pro skladové operace (příjem, přesun, inventura) přizpůsobený dotykovému ovládání. Viz R10.</w:t>
+            </w:r>
+          </w:p>
         </w:tc>
         <w:tc>
           <w:tcPr>
@@ -1545,332 +1970,17 @@
               <w:right w:w="100" w:type="dxa"/>
             </w:tcMar>
           </w:tcPr>
-          <w:p/>
-        </w:tc>
-      </w:tr>
-      <w:tr>
-        <w:trPr>
-          <w:trHeight w:val="624"/>
-        </w:trPr>
-        <w:tc>
-          <w:tcPr>
-            <w:tcW w:type="dxa" w:w="737"/>
-            <w:tcMar>
-              <w:top w:w="70" w:type="dxa"/>
-              <w:left w:w="100" w:type="dxa"/>
-              <w:bottom w:w="70" w:type="dxa"/>
-              <w:right w:w="100" w:type="dxa"/>
-            </w:tcMar>
-          </w:tcPr>
-          <w:p/>
-        </w:tc>
-        <w:tc>
-          <w:tcPr>
-            <w:tcW w:type="dxa" w:w="1417"/>
-            <w:tcMar>
-              <w:top w:w="70" w:type="dxa"/>
-              <w:left w:w="100" w:type="dxa"/>
-              <w:bottom w:w="70" w:type="dxa"/>
-              <w:right w:w="100" w:type="dxa"/>
-            </w:tcMar>
-          </w:tcPr>
-          <w:p/>
-        </w:tc>
-        <w:tc>
-          <w:tcPr>
-            <w:tcW w:type="dxa" w:w="2948"/>
-            <w:tcMar>
-              <w:top w:w="70" w:type="dxa"/>
-              <w:left w:w="100" w:type="dxa"/>
-              <w:bottom w:w="70" w:type="dxa"/>
-              <w:right w:w="100" w:type="dxa"/>
-            </w:tcMar>
-          </w:tcPr>
-          <w:p/>
-        </w:tc>
-        <w:tc>
-          <w:tcPr>
-            <w:tcW w:type="dxa" w:w="3288"/>
-            <w:tcMar>
-              <w:top w:w="70" w:type="dxa"/>
-              <w:left w:w="100" w:type="dxa"/>
-              <w:bottom w:w="70" w:type="dxa"/>
-              <w:right w:w="100" w:type="dxa"/>
-            </w:tcMar>
-          </w:tcPr>
-          <w:p/>
-        </w:tc>
-        <w:tc>
-          <w:tcPr>
-            <w:tcW w:type="dxa" w:w="1247"/>
-            <w:tcMar>
-              <w:top w:w="70" w:type="dxa"/>
-              <w:left w:w="100" w:type="dxa"/>
-              <w:bottom w:w="70" w:type="dxa"/>
-              <w:right w:w="100" w:type="dxa"/>
-            </w:tcMar>
-          </w:tcPr>
-          <w:p/>
-        </w:tc>
-      </w:tr>
-      <w:tr>
-        <w:trPr>
-          <w:trHeight w:val="624"/>
-        </w:trPr>
-        <w:tc>
-          <w:tcPr>
-            <w:tcW w:type="dxa" w:w="737"/>
-            <w:tcMar>
-              <w:top w:w="70" w:type="dxa"/>
-              <w:left w:w="100" w:type="dxa"/>
-              <w:bottom w:w="70" w:type="dxa"/>
-              <w:right w:w="100" w:type="dxa"/>
-            </w:tcMar>
-          </w:tcPr>
-          <w:p/>
-        </w:tc>
-        <w:tc>
-          <w:tcPr>
-            <w:tcW w:type="dxa" w:w="1417"/>
-            <w:tcMar>
-              <w:top w:w="70" w:type="dxa"/>
-              <w:left w:w="100" w:type="dxa"/>
-              <w:bottom w:w="70" w:type="dxa"/>
-              <w:right w:w="100" w:type="dxa"/>
-            </w:tcMar>
-          </w:tcPr>
-          <w:p/>
-        </w:tc>
-        <w:tc>
-          <w:tcPr>
-            <w:tcW w:type="dxa" w:w="2948"/>
-            <w:tcMar>
-              <w:top w:w="70" w:type="dxa"/>
-              <w:left w:w="100" w:type="dxa"/>
-              <w:bottom w:w="70" w:type="dxa"/>
-              <w:right w:w="100" w:type="dxa"/>
-            </w:tcMar>
-          </w:tcPr>
-          <w:p/>
-        </w:tc>
-        <w:tc>
-          <w:tcPr>
-            <w:tcW w:type="dxa" w:w="3288"/>
-            <w:tcMar>
-              <w:top w:w="70" w:type="dxa"/>
-              <w:left w:w="100" w:type="dxa"/>
-              <w:bottom w:w="70" w:type="dxa"/>
-              <w:right w:w="100" w:type="dxa"/>
-            </w:tcMar>
-          </w:tcPr>
-          <w:p/>
-        </w:tc>
-        <w:tc>
-          <w:tcPr>
-            <w:tcW w:type="dxa" w:w="1247"/>
-            <w:tcMar>
-              <w:top w:w="70" w:type="dxa"/>
-              <w:left w:w="100" w:type="dxa"/>
-              <w:bottom w:w="70" w:type="dxa"/>
-              <w:right w:w="100" w:type="dxa"/>
-            </w:tcMar>
-          </w:tcPr>
-          <w:p/>
-        </w:tc>
-      </w:tr>
-      <w:tr>
-        <w:trPr>
-          <w:trHeight w:val="624"/>
-        </w:trPr>
-        <w:tc>
-          <w:tcPr>
-            <w:tcW w:type="dxa" w:w="737"/>
-            <w:tcMar>
-              <w:top w:w="70" w:type="dxa"/>
-              <w:left w:w="100" w:type="dxa"/>
-              <w:bottom w:w="70" w:type="dxa"/>
-              <w:right w:w="100" w:type="dxa"/>
-            </w:tcMar>
-          </w:tcPr>
-          <w:p/>
-        </w:tc>
-        <w:tc>
-          <w:tcPr>
-            <w:tcW w:type="dxa" w:w="1417"/>
-            <w:tcMar>
-              <w:top w:w="70" w:type="dxa"/>
-              <w:left w:w="100" w:type="dxa"/>
-              <w:bottom w:w="70" w:type="dxa"/>
-              <w:right w:w="100" w:type="dxa"/>
-            </w:tcMar>
-          </w:tcPr>
-          <w:p/>
-        </w:tc>
-        <w:tc>
-          <w:tcPr>
-            <w:tcW w:type="dxa" w:w="2948"/>
-            <w:tcMar>
-              <w:top w:w="70" w:type="dxa"/>
-              <w:left w:w="100" w:type="dxa"/>
-              <w:bottom w:w="70" w:type="dxa"/>
-              <w:right w:w="100" w:type="dxa"/>
-            </w:tcMar>
-          </w:tcPr>
-          <w:p/>
-        </w:tc>
-        <w:tc>
-          <w:tcPr>
-            <w:tcW w:type="dxa" w:w="3288"/>
-            <w:tcMar>
-              <w:top w:w="70" w:type="dxa"/>
-              <w:left w:w="100" w:type="dxa"/>
-              <w:bottom w:w="70" w:type="dxa"/>
-              <w:right w:w="100" w:type="dxa"/>
-            </w:tcMar>
-          </w:tcPr>
-          <w:p/>
-        </w:tc>
-        <w:tc>
-          <w:tcPr>
-            <w:tcW w:type="dxa" w:w="1247"/>
-            <w:tcMar>
-              <w:top w:w="70" w:type="dxa"/>
-              <w:left w:w="100" w:type="dxa"/>
-              <w:bottom w:w="70" w:type="dxa"/>
-              <w:right w:w="100" w:type="dxa"/>
-            </w:tcMar>
-          </w:tcPr>
-          <w:p/>
-        </w:tc>
-      </w:tr>
-      <w:tr>
-        <w:trPr>
-          <w:trHeight w:val="624"/>
-        </w:trPr>
-        <w:tc>
-          <w:tcPr>
-            <w:tcW w:type="dxa" w:w="737"/>
-            <w:tcMar>
-              <w:top w:w="70" w:type="dxa"/>
-              <w:left w:w="100" w:type="dxa"/>
-              <w:bottom w:w="70" w:type="dxa"/>
-              <w:right w:w="100" w:type="dxa"/>
-            </w:tcMar>
-          </w:tcPr>
-          <w:p/>
-        </w:tc>
-        <w:tc>
-          <w:tcPr>
-            <w:tcW w:type="dxa" w:w="1417"/>
-            <w:tcMar>
-              <w:top w:w="70" w:type="dxa"/>
-              <w:left w:w="100" w:type="dxa"/>
-              <w:bottom w:w="70" w:type="dxa"/>
-              <w:right w:w="100" w:type="dxa"/>
-            </w:tcMar>
-          </w:tcPr>
-          <w:p/>
-        </w:tc>
-        <w:tc>
-          <w:tcPr>
-            <w:tcW w:type="dxa" w:w="2948"/>
-            <w:tcMar>
-              <w:top w:w="70" w:type="dxa"/>
-              <w:left w:w="100" w:type="dxa"/>
-              <w:bottom w:w="70" w:type="dxa"/>
-              <w:right w:w="100" w:type="dxa"/>
-            </w:tcMar>
-          </w:tcPr>
-          <w:p/>
-        </w:tc>
-        <w:tc>
-          <w:tcPr>
-            <w:tcW w:type="dxa" w:w="3288"/>
-            <w:tcMar>
-              <w:top w:w="70" w:type="dxa"/>
-              <w:left w:w="100" w:type="dxa"/>
-              <w:bottom w:w="70" w:type="dxa"/>
-              <w:right w:w="100" w:type="dxa"/>
-            </w:tcMar>
-          </w:tcPr>
-          <w:p/>
-        </w:tc>
-        <w:tc>
-          <w:tcPr>
-            <w:tcW w:type="dxa" w:w="1247"/>
-            <w:tcMar>
-              <w:top w:w="70" w:type="dxa"/>
-              <w:left w:w="100" w:type="dxa"/>
-              <w:bottom w:w="70" w:type="dxa"/>
-              <w:right w:w="100" w:type="dxa"/>
-            </w:tcMar>
-          </w:tcPr>
-          <w:p/>
-        </w:tc>
-      </w:tr>
-      <w:tr>
-        <w:trPr>
-          <w:trHeight w:val="624"/>
-        </w:trPr>
-        <w:tc>
-          <w:tcPr>
-            <w:tcW w:type="dxa" w:w="737"/>
-            <w:tcMar>
-              <w:top w:w="70" w:type="dxa"/>
-              <w:left w:w="100" w:type="dxa"/>
-              <w:bottom w:w="70" w:type="dxa"/>
-              <w:right w:w="100" w:type="dxa"/>
-            </w:tcMar>
-          </w:tcPr>
-          <w:p/>
-        </w:tc>
-        <w:tc>
-          <w:tcPr>
-            <w:tcW w:type="dxa" w:w="1417"/>
-            <w:tcMar>
-              <w:top w:w="70" w:type="dxa"/>
-              <w:left w:w="100" w:type="dxa"/>
-              <w:bottom w:w="70" w:type="dxa"/>
-              <w:right w:w="100" w:type="dxa"/>
-            </w:tcMar>
-          </w:tcPr>
-          <w:p/>
-        </w:tc>
-        <w:tc>
-          <w:tcPr>
-            <w:tcW w:type="dxa" w:w="2948"/>
-            <w:tcMar>
-              <w:top w:w="70" w:type="dxa"/>
-              <w:left w:w="100" w:type="dxa"/>
-              <w:bottom w:w="70" w:type="dxa"/>
-              <w:right w:w="100" w:type="dxa"/>
-            </w:tcMar>
-          </w:tcPr>
-          <w:p/>
-        </w:tc>
-        <w:tc>
-          <w:tcPr>
-            <w:tcW w:type="dxa" w:w="3288"/>
-            <w:tcMar>
-              <w:top w:w="70" w:type="dxa"/>
-              <w:left w:w="100" w:type="dxa"/>
-              <w:bottom w:w="70" w:type="dxa"/>
-              <w:right w:w="100" w:type="dxa"/>
-            </w:tcMar>
-          </w:tcPr>
-          <w:p/>
-        </w:tc>
-        <w:tc>
-          <w:tcPr>
-            <w:tcW w:type="dxa" w:w="1247"/>
-            <w:tcMar>
-              <w:top w:w="70" w:type="dxa"/>
-              <w:left w:w="100" w:type="dxa"/>
-              <w:bottom w:w="70" w:type="dxa"/>
-              <w:right w:w="100" w:type="dxa"/>
-            </w:tcMar>
-          </w:tcPr>
-          <w:p/>
+          <w:p>
+            <w:pPr>
+              <w:spacing w:after="0"/>
+            </w:pPr>
+            <w:r>
+              <w:rPr>
+                <w:sz w:val="20"/>
+              </w:rPr>
+              <w:t>rozpracováno</w:t>
+            </w:r>
+          </w:p>
         </w:tc>
       </w:tr>
     </w:tbl>

</xml_diff>

<commit_message>
feat: configure and verify Docker Compose stack with PostgreSQL 16 and multi-stage Alpine build
</commit_message>
<xml_diff>
--- a/PPRO-dokumentace-sablona-v1.docx
+++ b/PPRO-dokumentace-sablona-v1.docx
@@ -1436,6 +1436,14 @@
       </w:pPr>
       <w:r>
         <w:t>• Rentabilita a obrat (/reports): Měsíční obrat, nákupní náklady, hrubá marže a procentuální podíl na celkových tržbách členěný po kategoriích.</w:t>
+      </w:r>
+    </w:p>
+    <w:p>
+      <w:pPr>
+        <w:spacing w:after="120"/>
+      </w:pPr>
+      <w:r>
+        <w:t>• Kontejnerizace a databáze (Docker Compose): Kompletní aplikace i s produkční PostgreSQL 16 databází je plně kontejnerizována a ověřena spuštěním přes docker compose up.</w:t>
       </w:r>
     </w:p>
     <w:sectPr>

</xml_diff>